<commit_message>
Step 2: detect every text line with its style and position
- textlayout.py rebuilds lines from MuPDF's glyph trace: typing order for
  Arabic, English and mixed lines, direction, font/size/color/bold/italic
  per span, boxes in displayed-page coordinates (rotation and crop box)
- Arabic glyphs are checked against the font's own character table, which
  repairs Word's wrong labels in kashida-justified text and ligatures;
  lines that still can't be trusted are flagged uncertain
- Splits at table borders and column gaps, not at wide justified word gaps;
  superscripts and vowel marks join their line
- Tests: answer key from the Word fixtures, and a bidi round trip (python-bidi
  as oracle) that any PDF must pass, including private samples
- Website: tappable line boxes, a details panel, "show all text" and zoom
  up to 400% with sharper page images

Co-Authored-By: Claude Opus 5.5 <noreply@anthropic.com>
</commit_message>
<xml_diff>
--- a/backend/tests/fixtures/word/arabic-quotation.docx
+++ b/backend/tests/fixtures/word/arabic-quotation.docx
@@ -1225,7 +1225,17 @@
           <w:rtl w:val="false"/>
           <w:lang w:val="en-US" w:bidi="ar-SA"/>
         </w:rPr>
-        <w:t xml:space="preserve">Meta.</w:t>
+        <w:t xml:space="preserve">Meta</w:t>
+      </w:r>
+      <w:r>
+        <w:rPr>
+          <w:rFonts w:ascii="Arial" w:cs="Arial" w:eastAsia="Arial" w:hAnsi="Arial"/>
+          <w:sz w:val="24"/>
+          <w:szCs w:val="24"/>
+          <w:rtl/>
+          <w:lang w:val="en-US" w:bidi="ar-SA"/>
+        </w:rPr>
+        <w:t xml:space="preserve">.</w:t>
       </w:r>
     </w:p>
     <w:p>

</xml_diff>